<commit_message>
Update JD v2.0 reporting line to Senior Director of Marketing
Co-Authored-By: Claude Opus 4.8 <noreply@anthropic.com>
Claude-Session: https://claude.ai/code/session_01AUtRjXtMkumxUCgi6XL7i4
</commit_message>
<xml_diff>
--- a/hiring/Marketing-Technology-Analyst-JD-v2.docx
+++ b/hiring/Marketing-Technology-Analyst-JD-v2.docx
@@ -106,7 +106,7 @@
           <w:sz w:val="20"/>
           <w:szCs w:val="20"/>
         </w:rPr>
-        <w:t xml:space="preserve">Director of B2C Marketing</w:t>
+        <w:t xml:space="preserve">Senior Director of Marketing</w:t>
       </w:r>
     </w:p>
     <w:p>
@@ -276,7 +276,7 @@
           <w:sz w:val="21"/>
           <w:szCs w:val="21"/>
         </w:rPr>
-        <w:t xml:space="preserve">right hand to the Director of B2C Marketing</w:t>
+        <w:t xml:space="preserve">right hand to the Senior Director of Marketing</w:t>
       </w:r>
       <w:r>
         <w:rPr>
@@ -788,7 +788,7 @@
           <w:sz w:val="21"/>
           <w:szCs w:val="21"/>
         </w:rPr>
-        <w:t xml:space="preserve"> performance data to the Director — deliver insight and recommended next steps, not raw exports</w:t>
+        <w:t xml:space="preserve"> performance data to the Senior Director — deliver insight and recommended next steps, not raw exports</w:t>
       </w:r>
     </w:p>
     <w:p>

</xml_diff>